<commit_message>
amelioration du modele et checking de securité
</commit_message>
<xml_diff>
--- a/docs_build/note_presentation_CreditSurWA_v2.docx
+++ b/docs_build/note_presentation_CreditSurWA_v2.docx
@@ -198,7 +198,7 @@
         <w:jc w:val="both"/>
       </w:pPr>
       <w:r>
-        <w:t xml:space="preserve">Nous avons entraîné et comparé trois modèles : une régression logistique, une forêt aléatoire et un XGBoost. Le tableau ci-dessous résume les résultats obtenus sur le jeu de test (800 dossiers, 20% des données, mis de côté avant tout entraînement).</w:t>
+        <w:t xml:space="preserve">Nous avons entraîné et comparé cinq modèles - une régression logistique, une forêt aléatoire, XGBoost, LightGBM et CatBoost - plus un stacking combinant les cinq. Les données sont réparties en trois sous-ensembles disjoints, mis de côté avant tout entraînement : 70% pour l'entraînement (2800 dossiers), 15% pour la validation (600 dossiers, utilisée pour choisir le seuil de décision et le modèle final) et 15% pour le test (600 dossiers, utilisée une seule fois, à la toute fin, pour publier une performance honnête - méthodologie détaillée en 2.4). Le tableau ci-dessous résume les résultats obtenus sur la validation, pour la version de chaque modèle optimisée sur le F1-score de la classe défaut.</w:t>
       </w:r>
     </w:p>
     <w:tbl>
@@ -339,53 +339,53 @@
                 <w:sz w:val="20"/>
                 <w:szCs w:val="20"/>
               </w:rPr>
-              <w:t xml:space="preserve">0,710</w:t>
-            </w:r>
-          </w:p>
-        </w:tc>
-        <w:tc>
-          <w:tcPr>
-            <w:tcW w:type="dxa" w:w="1725"/>
-          </w:tcPr>
-          <w:p>
-            <w:r>
-              <w:rPr>
-                <w:b/>
-                <w:bCs/>
-                <w:sz w:val="20"/>
-                <w:szCs w:val="20"/>
-              </w:rPr>
-              <w:t xml:space="preserve">63,4 %</w:t>
-            </w:r>
-          </w:p>
-        </w:tc>
-        <w:tc>
-          <w:tcPr>
-            <w:tcW w:type="dxa" w:w="1725"/>
-          </w:tcPr>
-          <w:p>
-            <w:r>
-              <w:rPr>
-                <w:sz w:val="20"/>
-                <w:szCs w:val="20"/>
-              </w:rPr>
-              <w:t xml:space="preserve">0,536</w:t>
-            </w:r>
-          </w:p>
-        </w:tc>
-        <w:tc>
-          <w:tcPr>
-            <w:tcW w:type="dxa" w:w="1725"/>
-          </w:tcPr>
-          <w:p>
-            <w:r>
-              <w:rPr>
-                <w:b/>
-                <w:bCs/>
-                <w:sz w:val="20"/>
-                <w:szCs w:val="20"/>
-              </w:rPr>
-              <w:t xml:space="preserve">0,354</w:t>
+              <w:t xml:space="preserve">0,693</w:t>
+            </w:r>
+          </w:p>
+        </w:tc>
+        <w:tc>
+          <w:tcPr>
+            <w:tcW w:type="dxa" w:w="1725"/>
+          </w:tcPr>
+          <w:p>
+            <w:r>
+              <w:rPr>
+                <w:b/>
+                <w:bCs/>
+                <w:sz w:val="20"/>
+                <w:szCs w:val="20"/>
+              </w:rPr>
+              <w:t xml:space="preserve">54,0 %</w:t>
+            </w:r>
+          </w:p>
+        </w:tc>
+        <w:tc>
+          <w:tcPr>
+            <w:tcW w:type="dxa" w:w="1725"/>
+          </w:tcPr>
+          <w:p>
+            <w:r>
+              <w:rPr>
+                <w:sz w:val="20"/>
+                <w:szCs w:val="20"/>
+              </w:rPr>
+              <w:t xml:space="preserve">0,616</w:t>
+            </w:r>
+          </w:p>
+        </w:tc>
+        <w:tc>
+          <w:tcPr>
+            <w:tcW w:type="dxa" w:w="1725"/>
+          </w:tcPr>
+          <w:p>
+            <w:r>
+              <w:rPr>
+                <w:b/>
+                <w:bCs/>
+                <w:sz w:val="20"/>
+                <w:szCs w:val="20"/>
+              </w:rPr>
+              <w:t xml:space="preserve">0,359</w:t>
             </w:r>
           </w:p>
         </w:tc>
@@ -415,49 +415,49 @@
                 <w:sz w:val="20"/>
                 <w:szCs w:val="20"/>
               </w:rPr>
-              <w:t xml:space="preserve">0,702</w:t>
-            </w:r>
-          </w:p>
-        </w:tc>
-        <w:tc>
-          <w:tcPr>
-            <w:tcW w:type="dxa" w:w="1725"/>
-          </w:tcPr>
-          <w:p>
-            <w:r>
-              <w:rPr>
-                <w:sz w:val="20"/>
-                <w:szCs w:val="20"/>
-              </w:rPr>
-              <w:t xml:space="preserve">5,9 %</w:t>
-            </w:r>
-          </w:p>
-        </w:tc>
-        <w:tc>
-          <w:tcPr>
-            <w:tcW w:type="dxa" w:w="1725"/>
-          </w:tcPr>
-          <w:p>
-            <w:r>
-              <w:rPr>
-                <w:sz w:val="20"/>
-                <w:szCs w:val="20"/>
-              </w:rPr>
-              <w:t xml:space="preserve">0,332</w:t>
-            </w:r>
-          </w:p>
-        </w:tc>
-        <w:tc>
-          <w:tcPr>
-            <w:tcW w:type="dxa" w:w="1725"/>
-          </w:tcPr>
-          <w:p>
-            <w:r>
-              <w:rPr>
-                <w:sz w:val="20"/>
-                <w:szCs w:val="20"/>
-              </w:rPr>
-              <w:t xml:space="preserve">0,339</w:t>
+              <w:t xml:space="preserve">0,687</w:t>
+            </w:r>
+          </w:p>
+        </w:tc>
+        <w:tc>
+          <w:tcPr>
+            <w:tcW w:type="dxa" w:w="1725"/>
+          </w:tcPr>
+          <w:p>
+            <w:r>
+              <w:rPr>
+                <w:sz w:val="20"/>
+                <w:szCs w:val="20"/>
+              </w:rPr>
+              <w:t xml:space="preserve">27,6 %</w:t>
+            </w:r>
+          </w:p>
+        </w:tc>
+        <w:tc>
+          <w:tcPr>
+            <w:tcW w:type="dxa" w:w="1725"/>
+          </w:tcPr>
+          <w:p>
+            <w:r>
+              <w:rPr>
+                <w:sz w:val="20"/>
+                <w:szCs w:val="20"/>
+              </w:rPr>
+              <w:t xml:space="preserve">0,408</w:t>
+            </w:r>
+          </w:p>
+        </w:tc>
+        <w:tc>
+          <w:tcPr>
+            <w:tcW w:type="dxa" w:w="1725"/>
+          </w:tcPr>
+          <w:p>
+            <w:r>
+              <w:rPr>
+                <w:sz w:val="20"/>
+                <w:szCs w:val="20"/>
+              </w:rPr>
+              <w:t xml:space="preserve">0,335</w:t>
             </w:r>
           </w:p>
         </w:tc>
@@ -487,6 +487,150 @@
                 <w:sz w:val="20"/>
                 <w:szCs w:val="20"/>
               </w:rPr>
+              <w:t xml:space="preserve">0,716</w:t>
+            </w:r>
+          </w:p>
+        </w:tc>
+        <w:tc>
+          <w:tcPr>
+            <w:tcW w:type="dxa" w:w="1725"/>
+          </w:tcPr>
+          <w:p>
+            <w:r>
+              <w:rPr>
+                <w:sz w:val="20"/>
+                <w:szCs w:val="20"/>
+              </w:rPr>
+              <w:t xml:space="preserve">5,3 %</w:t>
+            </w:r>
+          </w:p>
+        </w:tc>
+        <w:tc>
+          <w:tcPr>
+            <w:tcW w:type="dxa" w:w="1725"/>
+          </w:tcPr>
+          <w:p>
+            <w:r>
+              <w:rPr>
+                <w:sz w:val="20"/>
+                <w:szCs w:val="20"/>
+              </w:rPr>
+              <w:t xml:space="preserve">0,344</w:t>
+            </w:r>
+          </w:p>
+        </w:tc>
+        <w:tc>
+          <w:tcPr>
+            <w:tcW w:type="dxa" w:w="1725"/>
+          </w:tcPr>
+          <w:p>
+            <w:r>
+              <w:rPr>
+                <w:sz w:val="20"/>
+                <w:szCs w:val="20"/>
+              </w:rPr>
+              <w:t xml:space="preserve">0,353</w:t>
+            </w:r>
+          </w:p>
+        </w:tc>
+      </w:tr>
+      <w:tr>
+        <w:tc>
+          <w:tcPr>
+            <w:tcW w:type="dxa" w:w="2450"/>
+          </w:tcPr>
+          <w:p>
+            <w:r>
+              <w:rPr>
+                <w:sz w:val="20"/>
+                <w:szCs w:val="20"/>
+              </w:rPr>
+              <w:t xml:space="preserve">LightGBM</w:t>
+            </w:r>
+          </w:p>
+        </w:tc>
+        <w:tc>
+          <w:tcPr>
+            <w:tcW w:type="dxa" w:w="1725"/>
+          </w:tcPr>
+          <w:p>
+            <w:r>
+              <w:rPr>
+                <w:sz w:val="20"/>
+                <w:szCs w:val="20"/>
+              </w:rPr>
+              <w:t xml:space="preserve">0,709</w:t>
+            </w:r>
+          </w:p>
+        </w:tc>
+        <w:tc>
+          <w:tcPr>
+            <w:tcW w:type="dxa" w:w="1725"/>
+          </w:tcPr>
+          <w:p>
+            <w:r>
+              <w:rPr>
+                <w:sz w:val="20"/>
+                <w:szCs w:val="20"/>
+              </w:rPr>
+              <w:t xml:space="preserve">5,3 %</w:t>
+            </w:r>
+          </w:p>
+        </w:tc>
+        <w:tc>
+          <w:tcPr>
+            <w:tcW w:type="dxa" w:w="1725"/>
+          </w:tcPr>
+          <w:p>
+            <w:r>
+              <w:rPr>
+                <w:sz w:val="20"/>
+                <w:szCs w:val="20"/>
+              </w:rPr>
+              <w:t xml:space="preserve">0,358</w:t>
+            </w:r>
+          </w:p>
+        </w:tc>
+        <w:tc>
+          <w:tcPr>
+            <w:tcW w:type="dxa" w:w="1725"/>
+          </w:tcPr>
+          <w:p>
+            <w:r>
+              <w:rPr>
+                <w:sz w:val="20"/>
+                <w:szCs w:val="20"/>
+              </w:rPr>
+              <w:t xml:space="preserve">0,343</w:t>
+            </w:r>
+          </w:p>
+        </w:tc>
+      </w:tr>
+      <w:tr>
+        <w:tc>
+          <w:tcPr>
+            <w:tcW w:type="dxa" w:w="2450"/>
+          </w:tcPr>
+          <w:p>
+            <w:r>
+              <w:rPr>
+                <w:sz w:val="20"/>
+                <w:szCs w:val="20"/>
+              </w:rPr>
+              <w:t xml:space="preserve">CatBoost</w:t>
+            </w:r>
+          </w:p>
+        </w:tc>
+        <w:tc>
+          <w:tcPr>
+            <w:tcW w:type="dxa" w:w="1725"/>
+          </w:tcPr>
+          <w:p>
+            <w:r>
+              <w:rPr>
+                <w:sz w:val="20"/>
+                <w:szCs w:val="20"/>
+              </w:rPr>
               <w:t xml:space="preserve">0,718</w:t>
             </w:r>
           </w:p>
@@ -501,35 +645,35 @@
                 <w:sz w:val="20"/>
                 <w:szCs w:val="20"/>
               </w:rPr>
-              <w:t xml:space="preserve">6,9 %</w:t>
-            </w:r>
-          </w:p>
-        </w:tc>
-        <w:tc>
-          <w:tcPr>
-            <w:tcW w:type="dxa" w:w="1725"/>
-          </w:tcPr>
-          <w:p>
-            <w:r>
-              <w:rPr>
-                <w:sz w:val="20"/>
-                <w:szCs w:val="20"/>
-              </w:rPr>
-              <w:t xml:space="preserve">0,290</w:t>
-            </w:r>
-          </w:p>
-        </w:tc>
-        <w:tc>
-          <w:tcPr>
-            <w:tcW w:type="dxa" w:w="1725"/>
-          </w:tcPr>
-          <w:p>
-            <w:r>
-              <w:rPr>
-                <w:sz w:val="20"/>
-                <w:szCs w:val="20"/>
-              </w:rPr>
-              <w:t xml:space="preserve">0,348</w:t>
+              <w:t xml:space="preserve">2,6 %</w:t>
+            </w:r>
+          </w:p>
+        </w:tc>
+        <w:tc>
+          <w:tcPr>
+            <w:tcW w:type="dxa" w:w="1725"/>
+          </w:tcPr>
+          <w:p>
+            <w:r>
+              <w:rPr>
+                <w:sz w:val="20"/>
+                <w:szCs w:val="20"/>
+              </w:rPr>
+              <w:t xml:space="preserve">0,292</w:t>
+            </w:r>
+          </w:p>
+        </w:tc>
+        <w:tc>
+          <w:tcPr>
+            <w:tcW w:type="dxa" w:w="1725"/>
+          </w:tcPr>
+          <w:p>
+            <w:r>
+              <w:rPr>
+                <w:sz w:val="20"/>
+                <w:szCs w:val="20"/>
+              </w:rPr>
+              <w:t xml:space="preserve">0,339</w:t>
             </w:r>
           </w:p>
         </w:tc>
@@ -546,16 +690,16 @@
         <w:jc w:val="both"/>
       </w:pPr>
       <w:r>
-        <w:t xml:space="preserve">Le choix ne s'est pas fait sur l'accuracy brute (87% pour Random Forest et XGBoost contre 66% pour la régression logistique), qui est ici un indicateur trompeur : avec seulement 12,6% de dossiers en défaut dans le jeu de données, un modèle qui prédit systématiquement "bon payeur" affiche déjà une accuracy élevée sans être utile. La preuve la plus directe de ce problème est le rappel de la classe défaut au seuil de décision par défaut (0,5) : la régression logistique détecte 63,4% des dossiers réellement en défaut, contre seulement 5,9% pour Random Forest et 6,9% pour XGBoost. Ces deux derniers modèles, dominés par la classe majoritaire, se replient presque systématiquement sur "bon payeur" et laissent passer l'essentiel des mauvais payeurs - or dans une coopérative, laisser passer un mauvais payeur coûte structurellement plus cher qu'examiner un bon dossier avec un peu plus de prudence.</w:t>
-      </w:r>
-    </w:p>
-    <w:p>
-      <w:pPr>
-        <w:spacing w:after="140"/>
-        <w:jc w:val="both"/>
-      </w:pPr>
-      <w:r>
-        <w:t xml:space="preserve">Une fois le seuil de décision optimisé séparément pour chaque modèle (recherche du seuil qui maximise le F1-score sur la classe défaut), l'écart se resserre : la régression logistique conserve un léger avantage (F1 = 0,354) sur XGBoost (0,348) et Random Forest (0,339), avec un ROC-AUC très proche des trois modèles (0,710 pour la régression logistique contre 0,718 pour XGBoost, un écart qui n'est pas significatif compte tenu de la taille du jeu de test). À performance quasi équivalente une fois les seuils calibrés, trois raisons ont fait pencher la balance en faveur de la régression logistique plutôt que XGBoost : premièrement, elle est directement interprétable via ses coefficients, ce qui rend l'explication SHAP plus fidèle et plus simple à restituer à un agent de crédit sans formation en machine learning ; deuxièmement, elle est mécaniquement plus stable et moins sujette au sur-apprentissage sur un jeu de données encore synthétique et de taille modeste (3 200 dossiers d'entraînement) qu'un modèle à forte capacité comme XGBoost ; troisièmement, elle sera plus simple et moins coûteuse à ré-entraîner lors du recalibrage prévu sur des données réelles de coopérative.</w:t>
+        <w:t xml:space="preserve">Le choix ne s'est pas fait sur l'accuracy brute (83-87% pour les modèles à base d'arbres contre 67% pour la régression logistique), qui est ici un indicateur trompeur : avec seulement 12,6% de dossiers en défaut dans le jeu de données, un modèle qui prédit systématiquement "bon payeur" affiche déjà une accuracy élevée sans être utile. La preuve la plus directe de ce problème est le rappel de la classe défaut au seuil de décision par défaut (0,5) : la régression logistique détecte 54,0% des dossiers réellement en défaut à ce seuil, contre 2,6 à 27,6% pour les modèles à base d'arbres. Ces derniers, dominés par la classe majoritaire à seuil non calibré, se replient presque systématiquement sur "bon payeur" et laissent passer l'essentiel des mauvais payeurs - or dans une coopérative, laisser passer un mauvais payeur coûte structurellement plus cher qu'examiner un bon dossier avec un peu plus de prudence.</w:t>
+      </w:r>
+    </w:p>
+    <w:p>
+      <w:pPr>
+        <w:spacing w:after="140"/>
+        <w:jc w:val="both"/>
+      </w:pPr>
+      <w:r>
+        <w:t xml:space="preserve">Une fois le seuil de décision optimisé séparément pour chaque modèle (recherche du seuil qui maximise le F1-score sur la classe défaut) et les hyperparamètres réglés par recherche bayésienne plutôt que fixés à la main (2.4), la régression logistique conserve l'avantage (F1 = 0,359) sur XGBoost (0,353), LightGBM (0,343), CatBoost (0,339) et Random Forest (0,335). Elle minimise également le coût métier attendu (FN/FP, méthodologie en 2.4), avec une marge nette sur les autres modèles. À performance technique favorable, elle a donc été retenue à la fois pour de bonnes raisons statistiques et parce qu'elle reste directement interprétable via ses coefficients, ce qui rend l'explication SHAP (LinearExplainer, cf. 2.5) plus simple et plus fidèle à restituer à un agent de crédit sans formation en machine learning qu'un modèle à base d'arbres.</w:t>
       </w:r>
     </w:p>
     <w:p>
@@ -564,25 +708,504 @@
         <w:spacing w:after="90" w:before="180"/>
       </w:pPr>
       <w:r>
-        <w:t xml:space="preserve">2.4. Décision à trois niveaux et explicabilité</w:t>
-      </w:r>
-    </w:p>
-    <w:p>
-      <w:pPr>
-        <w:spacing w:after="140"/>
-        <w:jc w:val="both"/>
-      </w:pPr>
-      <w:r>
-        <w:t xml:space="preserve">Plutôt qu'une réponse binaire accordé/refusé, l'outil restitue une probabilité de défaut et la classe dans l'une de trois zones : verte (dossier plutôt sûr), orange (à examiner en comité de crédit) et rouge (risque élevé). Les seuils de ces zones sont calculés automatiquement autour du seuil de décision optimal du modèle retenu, et non fixés arbitrairement à 50%. L'agent garde la main sur la décision finale, en particulier sur les dossiers orange.</w:t>
-      </w:r>
-    </w:p>
-    <w:p>
-      <w:pPr>
-        <w:spacing w:after="140"/>
-        <w:jc w:val="both"/>
-      </w:pPr>
-      <w:r>
-        <w:t xml:space="preserve">Pour chaque dossier évalué, l'application affiche également les facteurs qui ont le plus pesé sur le score, calculés avec SHAP et présentés en français plutôt que sous forme de coefficients bruts. L'objectif est qu'un agent puisse dire à un client "votre dossier est jugé plus risqué parce que X et Y", et pas seulement lui communiquer un chiffre.</w:t>
+        <w:t xml:space="preserve">2.4. Optimisation des hyperparamètres, du seuil de décision et protocole d'évaluation</w:t>
+      </w:r>
+    </w:p>
+    <w:p>
+      <w:pPr>
+        <w:spacing w:after="140"/>
+        <w:jc w:val="both"/>
+      </w:pPr>
+      <w:r>
+        <w:t xml:space="preserve">Dans une version antérieure de ce travail, les hyperparamètres de chaque modèle (nombre d'arbres, profondeur, taux d'apprentissage...) avaient été fixés "à dire d'expert", sans recherche ni référence documentée - une lacune méthodologique que nous avons corrigée. Chaque modèle est maintenant réglé par recherche bayésienne (Optuna, TPESampler - Akiba et al., 2019), sur un espace de recherche dont les bornes sont documentées en commentaire dans le code (`scripts/02_train_model.py`) et justifiées par la littérature du credit scoring : échelle logarithmique de régularisation pour la régression logistique (Lessmann et al., 2015 ; Siddiqi, 2017), profondeur d'arbre limitée pour Random Forest (Brown &amp; Mues, 2012), arbres peu profonds et sous-échantillonnage pour les boosting XGBoost/LightGBM/CatBoost (Chen &amp; Guestrin, 2016 ; Xia et al., 2017 ; Ke et al., 2017 ; Prokhorenkova et al., 2018). Le prétraitement (imputation, standardisation, encodage) et SMOTE sont tous deux imbriqués à l'intérieur de chaque pipeline de modèle et réappliqués à chaque pli de validation croisée - et non plus ajustés une fois pour toutes avant la recherche - pour éviter toute fuite d'information entre les plis d'entraînement et de validation.</w:t>
+      </w:r>
+    </w:p>
+    <w:p>
+      <w:pPr>
+        <w:spacing w:after="140"/>
+        <w:jc w:val="both"/>
+      </w:pPr>
+      <w:r>
+        <w:t xml:space="preserve">Deuxième amélioration, plus structurelle : une relecture externe du projet a identifié qu'une version antérieure de ce script utilisait le jeu de test à la fois pour choisir le seuil de décision ET pour choisir le modèle final - ce qui revient à évaluer une décision de sélection sur les mêmes données que celles utilisées pour la prendre, et biaise optimistement la performance annoncée. Nous avons corrigé le protocole en 3 sous-ensembles disjoints (2.3) : la recherche Optuna optimise sur des plis de validation croisée internes au TRAIN, le choix du modèle et du seuil se fait sur VALIDATION, et TEST n'intervient plus qu'une seule fois, à la toute fin, pour un chiffre honnête (paragraphe suivant).</w:t>
+      </w:r>
+    </w:p>
+    <w:p>
+      <w:pPr>
+        <w:spacing w:after="140"/>
+        <w:jc w:val="both"/>
+      </w:pPr>
+      <w:r>
+        <w:t xml:space="preserve">Troisième amélioration : au-delà du F1-score, chaque modèle est aussi optimisé sur un critère de coût métier attendu, qui distingue explicitement le coût d'un faux négatif (crédit accordé à un mauvais payeur) de celui d'un faux positif (bon dossier refusé à tort) - ces deux erreurs n'ayant pas le même impact financier pour la coopérative. Le coût d'un faux négatif est estimé comme le montant du crédit multiplié par la perte en cas de défaut (LGD - Loss Given Default), en réutilisant la même table LGD par type de garantie déjà utilisée par le moteur IA pour afficher la perte attendue à l'agent (35% pour un bien matériel, 40% pour une caution solidaire, 45% pour l'aval d'un tiers, 65% en l'absence de garantie), plutôt que d'introduire une deuxième hypothèse LGD qui aurait divergé de celle déjà en production. Le coût d'un faux positif est estimé comme la marge d'intérêt non perçue (12% du montant, cohérent avec la formule de mensualité du générateur de données). Ces hypothèses de coût restent, comme le reste du dataset, à recalibrer avec les données réelles de recouvrement d'une coopérative partenaire.</w:t>
+      </w:r>
+    </w:p>
+    <w:tbl>
+      <w:tblPr>
+        <w:tblW w:type="dxa" w:w="9350"/>
+        <w:tblBorders>
+          <w:top w:val="single" w:color="auto" w:sz="4"/>
+          <w:left w:val="single" w:color="auto" w:sz="4"/>
+          <w:bottom w:val="single" w:color="auto" w:sz="4"/>
+          <w:right w:val="single" w:color="auto" w:sz="4"/>
+          <w:insideH w:val="single" w:color="auto" w:sz="4"/>
+          <w:insideV w:val="single" w:color="auto" w:sz="4"/>
+        </w:tblBorders>
+      </w:tblPr>
+      <w:tblGrid>
+        <w:gridCol w:w="3117"/>
+        <w:gridCol w:w="2411"/>
+        <w:gridCol w:w="2411"/>
+        <w:gridCol w:w="1411"/>
+      </w:tblGrid>
+      <w:tr>
+        <w:tc>
+          <w:tcPr>
+            <w:tcW w:type="dxa" w:w="3117"/>
+            <w:shd w:fill="1F3864" w:val="clear"/>
+          </w:tcPr>
+          <w:p>
+            <w:r>
+              <w:rPr>
+                <w:b/>
+                <w:bCs/>
+                <w:color w:val="FFFFFF"/>
+                <w:sz w:val="20"/>
+                <w:szCs w:val="20"/>
+              </w:rPr>
+              <w:t xml:space="preserve">Modèle</w:t>
+            </w:r>
+          </w:p>
+        </w:tc>
+        <w:tc>
+          <w:tcPr>
+            <w:tcW w:type="dxa" w:w="2411"/>
+            <w:shd w:fill="1F3864" w:val="clear"/>
+          </w:tcPr>
+          <w:p>
+            <w:r>
+              <w:rPr>
+                <w:b/>
+                <w:bCs/>
+                <w:color w:val="FFFFFF"/>
+                <w:sz w:val="20"/>
+                <w:szCs w:val="20"/>
+              </w:rPr>
+              <w:t xml:space="preserve">Seuil financier optimal</w:t>
+            </w:r>
+          </w:p>
+        </w:tc>
+        <w:tc>
+          <w:tcPr>
+            <w:tcW w:type="dxa" w:w="2411"/>
+            <w:shd w:fill="1F3864" w:val="clear"/>
+          </w:tcPr>
+          <w:p>
+            <w:r>
+              <w:rPr>
+                <w:b/>
+                <w:bCs/>
+                <w:color w:val="FFFFFF"/>
+                <w:sz w:val="20"/>
+                <w:szCs w:val="20"/>
+              </w:rPr>
+              <w:t xml:space="preserve">Coût attendu (FCFA, 600 dossiers validation)</w:t>
+            </w:r>
+          </w:p>
+        </w:tc>
+        <w:tc>
+          <w:tcPr>
+            <w:tcW w:type="dxa" w:w="1411"/>
+            <w:shd w:fill="1F3864" w:val="clear"/>
+          </w:tcPr>
+          <w:p>
+            <w:r>
+              <w:rPr>
+                <w:b/>
+                <w:bCs/>
+                <w:color w:val="FFFFFF"/>
+                <w:sz w:val="20"/>
+                <w:szCs w:val="20"/>
+              </w:rPr>
+              <w:t xml:space="preserve">Déployable ?</w:t>
+            </w:r>
+          </w:p>
+        </w:tc>
+      </w:tr>
+      <w:tr>
+        <w:tc>
+          <w:tcPr>
+            <w:tcW w:type="dxa" w:w="3117"/>
+          </w:tcPr>
+          <w:p>
+            <w:r>
+              <w:rPr>
+                <w:b/>
+                <w:bCs/>
+                <w:sz w:val="20"/>
+                <w:szCs w:val="20"/>
+              </w:rPr>
+              <w:t xml:space="preserve">Régression Logistique</w:t>
+            </w:r>
+          </w:p>
+        </w:tc>
+        <w:tc>
+          <w:tcPr>
+            <w:tcW w:type="dxa" w:w="2411"/>
+          </w:tcPr>
+          <w:p>
+            <w:r>
+              <w:rPr>
+                <w:sz w:val="20"/>
+                <w:szCs w:val="20"/>
+              </w:rPr>
+              <w:t xml:space="preserve">0,74</w:t>
+            </w:r>
+          </w:p>
+        </w:tc>
+        <w:tc>
+          <w:tcPr>
+            <w:tcW w:type="dxa" w:w="2411"/>
+          </w:tcPr>
+          <w:p>
+            <w:r>
+              <w:rPr>
+                <w:b/>
+                <w:bCs/>
+                <w:sz w:val="20"/>
+                <w:szCs w:val="20"/>
+              </w:rPr>
+              <w:t xml:space="preserve">8 116 400</w:t>
+            </w:r>
+          </w:p>
+        </w:tc>
+        <w:tc>
+          <w:tcPr>
+            <w:tcW w:type="dxa" w:w="1411"/>
+          </w:tcPr>
+          <w:p>
+            <w:r>
+              <w:rPr>
+                <w:b/>
+                <w:bCs/>
+                <w:sz w:val="20"/>
+                <w:szCs w:val="20"/>
+              </w:rPr>
+              <w:t xml:space="preserve">Oui - retenu</w:t>
+            </w:r>
+          </w:p>
+        </w:tc>
+      </w:tr>
+      <w:tr>
+        <w:tc>
+          <w:tcPr>
+            <w:tcW w:type="dxa" w:w="3117"/>
+          </w:tcPr>
+          <w:p>
+            <w:r>
+              <w:rPr>
+                <w:sz w:val="20"/>
+                <w:szCs w:val="20"/>
+              </w:rPr>
+              <w:t xml:space="preserve">Stacking (benchmark)</w:t>
+            </w:r>
+          </w:p>
+        </w:tc>
+        <w:tc>
+          <w:tcPr>
+            <w:tcW w:type="dxa" w:w="2411"/>
+          </w:tcPr>
+          <w:p>
+            <w:r>
+              <w:rPr>
+                <w:sz w:val="20"/>
+                <w:szCs w:val="20"/>
+              </w:rPr>
+              <w:t xml:space="preserve">0,30</w:t>
+            </w:r>
+          </w:p>
+        </w:tc>
+        <w:tc>
+          <w:tcPr>
+            <w:tcW w:type="dxa" w:w="2411"/>
+          </w:tcPr>
+          <w:p>
+            <w:r>
+              <w:rPr>
+                <w:sz w:val="20"/>
+                <w:szCs w:val="20"/>
+              </w:rPr>
+              <w:t xml:space="preserve">8 773 260</w:t>
+            </w:r>
+          </w:p>
+        </w:tc>
+        <w:tc>
+          <w:tcPr>
+            <w:tcW w:type="dxa" w:w="1411"/>
+          </w:tcPr>
+          <w:p>
+            <w:r>
+              <w:rPr>
+                <w:sz w:val="20"/>
+                <w:szCs w:val="20"/>
+              </w:rPr>
+              <w:t xml:space="preserve">Non (SHAP)</w:t>
+            </w:r>
+          </w:p>
+        </w:tc>
+      </w:tr>
+      <w:tr>
+        <w:tc>
+          <w:tcPr>
+            <w:tcW w:type="dxa" w:w="3117"/>
+          </w:tcPr>
+          <w:p>
+            <w:r>
+              <w:rPr>
+                <w:sz w:val="20"/>
+                <w:szCs w:val="20"/>
+              </w:rPr>
+              <w:t xml:space="preserve">LightGBM</w:t>
+            </w:r>
+          </w:p>
+        </w:tc>
+        <w:tc>
+          <w:tcPr>
+            <w:tcW w:type="dxa" w:w="2411"/>
+          </w:tcPr>
+          <w:p>
+            <w:r>
+              <w:rPr>
+                <w:sz w:val="20"/>
+                <w:szCs w:val="20"/>
+              </w:rPr>
+              <w:t xml:space="preserve">0,36</w:t>
+            </w:r>
+          </w:p>
+        </w:tc>
+        <w:tc>
+          <w:tcPr>
+            <w:tcW w:type="dxa" w:w="2411"/>
+          </w:tcPr>
+          <w:p>
+            <w:r>
+              <w:rPr>
+                <w:sz w:val="20"/>
+                <w:szCs w:val="20"/>
+              </w:rPr>
+              <w:t xml:space="preserve">8 852 590</w:t>
+            </w:r>
+          </w:p>
+        </w:tc>
+        <w:tc>
+          <w:tcPr>
+            <w:tcW w:type="dxa" w:w="1411"/>
+          </w:tcPr>
+          <w:p>
+            <w:r>
+              <w:rPr>
+                <w:sz w:val="20"/>
+                <w:szCs w:val="20"/>
+              </w:rPr>
+              <w:t xml:space="preserve">Oui</w:t>
+            </w:r>
+          </w:p>
+        </w:tc>
+      </w:tr>
+      <w:tr>
+        <w:tc>
+          <w:tcPr>
+            <w:tcW w:type="dxa" w:w="3117"/>
+          </w:tcPr>
+          <w:p>
+            <w:r>
+              <w:rPr>
+                <w:sz w:val="20"/>
+                <w:szCs w:val="20"/>
+              </w:rPr>
+              <w:t xml:space="preserve">XGBoost</w:t>
+            </w:r>
+          </w:p>
+        </w:tc>
+        <w:tc>
+          <w:tcPr>
+            <w:tcW w:type="dxa" w:w="2411"/>
+          </w:tcPr>
+          <w:p>
+            <w:r>
+              <w:rPr>
+                <w:sz w:val="20"/>
+                <w:szCs w:val="20"/>
+              </w:rPr>
+              <w:t xml:space="preserve">0,34</w:t>
+            </w:r>
+          </w:p>
+        </w:tc>
+        <w:tc>
+          <w:tcPr>
+            <w:tcW w:type="dxa" w:w="2411"/>
+          </w:tcPr>
+          <w:p>
+            <w:r>
+              <w:rPr>
+                <w:sz w:val="20"/>
+                <w:szCs w:val="20"/>
+              </w:rPr>
+              <w:t xml:space="preserve">8 861 610</w:t>
+            </w:r>
+          </w:p>
+        </w:tc>
+        <w:tc>
+          <w:tcPr>
+            <w:tcW w:type="dxa" w:w="1411"/>
+          </w:tcPr>
+          <w:p>
+            <w:r>
+              <w:rPr>
+                <w:sz w:val="20"/>
+                <w:szCs w:val="20"/>
+              </w:rPr>
+              <w:t xml:space="preserve">Oui</w:t>
+            </w:r>
+          </w:p>
+        </w:tc>
+      </w:tr>
+      <w:tr>
+        <w:tc>
+          <w:tcPr>
+            <w:tcW w:type="dxa" w:w="3117"/>
+          </w:tcPr>
+          <w:p>
+            <w:r>
+              <w:rPr>
+                <w:sz w:val="20"/>
+                <w:szCs w:val="20"/>
+              </w:rPr>
+              <w:t xml:space="preserve">Random Forest</w:t>
+            </w:r>
+          </w:p>
+        </w:tc>
+        <w:tc>
+          <w:tcPr>
+            <w:tcW w:type="dxa" w:w="2411"/>
+          </w:tcPr>
+          <w:p>
+            <w:r>
+              <w:rPr>
+                <w:sz w:val="20"/>
+                <w:szCs w:val="20"/>
+              </w:rPr>
+              <w:t xml:space="preserve">0,50</w:t>
+            </w:r>
+          </w:p>
+        </w:tc>
+        <w:tc>
+          <w:tcPr>
+            <w:tcW w:type="dxa" w:w="2411"/>
+          </w:tcPr>
+          <w:p>
+            <w:r>
+              <w:rPr>
+                <w:sz w:val="20"/>
+                <w:szCs w:val="20"/>
+              </w:rPr>
+              <w:t xml:space="preserve">8 894 760</w:t>
+            </w:r>
+          </w:p>
+        </w:tc>
+        <w:tc>
+          <w:tcPr>
+            <w:tcW w:type="dxa" w:w="1411"/>
+          </w:tcPr>
+          <w:p>
+            <w:r>
+              <w:rPr>
+                <w:sz w:val="20"/>
+                <w:szCs w:val="20"/>
+              </w:rPr>
+              <w:t xml:space="preserve">Oui</w:t>
+            </w:r>
+          </w:p>
+        </w:tc>
+      </w:tr>
+      <w:tr>
+        <w:tc>
+          <w:tcPr>
+            <w:tcW w:type="dxa" w:w="3117"/>
+          </w:tcPr>
+          <w:p>
+            <w:r>
+              <w:rPr>
+                <w:sz w:val="20"/>
+                <w:szCs w:val="20"/>
+              </w:rPr>
+              <w:t xml:space="preserve">CatBoost</w:t>
+            </w:r>
+          </w:p>
+        </w:tc>
+        <w:tc>
+          <w:tcPr>
+            <w:tcW w:type="dxa" w:w="2411"/>
+          </w:tcPr>
+          <w:p>
+            <w:r>
+              <w:rPr>
+                <w:sz w:val="20"/>
+                <w:szCs w:val="20"/>
+              </w:rPr>
+              <w:t xml:space="preserve">0,39</w:t>
+            </w:r>
+          </w:p>
+        </w:tc>
+        <w:tc>
+          <w:tcPr>
+            <w:tcW w:type="dxa" w:w="2411"/>
+          </w:tcPr>
+          <w:p>
+            <w:r>
+              <w:rPr>
+                <w:sz w:val="20"/>
+                <w:szCs w:val="20"/>
+              </w:rPr>
+              <w:t xml:space="preserve">9 034 940</w:t>
+            </w:r>
+          </w:p>
+        </w:tc>
+        <w:tc>
+          <w:tcPr>
+            <w:tcW w:type="dxa" w:w="1411"/>
+          </w:tcPr>
+          <w:p>
+            <w:r>
+              <w:rPr>
+                <w:sz w:val="20"/>
+                <w:szCs w:val="20"/>
+              </w:rPr>
+              <w:t xml:space="preserve">Oui</w:t>
+            </w:r>
+          </w:p>
+        </w:tc>
+      </w:tr>
+    </w:tbl>
+    <w:p>
+      <w:pPr>
+        <w:spacing w:after="160"/>
+      </w:pPr>
+    </w:p>
+    <w:p>
+      <w:pPr>
+        <w:spacing w:after="140"/>
+        <w:jc w:val="both"/>
+      </w:pPr>
+      <w:r>
+        <w:t xml:space="preserve">La régression logistique minimise ce coût attendu sur validation (8,12 millions FCFA sur 600 dossiers, contre 8,77 à 9,03 millions pour les autres modèles), avec un gain de 2,88 millions FCFA par rapport à un seuil de décision fixé arbitrairement à 0,5. Le stacking fait légèrement mieux que les modèles à base d'arbres, mais n'a pas été retenu pour le déploiement : c'est un méta-modèle combinant les sorties de cinq modèles, sans explication SHAP native et fidèle par variable au niveau d'un dossier individuel, ce qui casserait l'engagement d'explicabilité pris en 2.5. Il reste documenté ici à titre de référence.</w:t>
+      </w:r>
+    </w:p>
+    <w:p>
+      <w:pPr>
+        <w:spacing w:after="140"/>
+        <w:jc w:val="both"/>
+      </w:pPr>
+      <w:r>
+        <w:t xml:space="preserve">Résultat final, sur le test tenu à l'écart de toute décision (600 dossiers, jamais regardés avant cette évaluation) : ROC-AUC = 0,752 (en hausse par rapport à la validation - fluctuation normale sur un échantillon de cette taille, à ne pas sur-interpréter), mais le seuil optimisé sur validation (0,74) fait légèrement moins bien sur ce test que le seuil naïf 0,5 (coût de 9,13 millions FCFA, contre un gain positif attendu sur validation). Nous préférons publier ce résultat tel quel plutôt que de le lisser : avec seulement 600 dossiers de validation (dont environ 76 en défaut), le seuil optimal exact est estimé avec un vrai bruit d'échantillonnage, et ce type d'écart entre validation et test est un signal attendu, pas une anomalie à corriger a posteriori. Une piste d'amélioration documentée en section 4 est de stabiliser ce seuil par validation croisée répétée (bootstrap) plutôt que par un unique point de validation, une fois un volume de données réel plus important disponible.</w:t>
       </w:r>
     </w:p>
     <w:p>
@@ -591,16 +1214,43 @@
         <w:spacing w:after="90" w:before="180"/>
       </w:pPr>
       <w:r>
-        <w:t xml:space="preserve">2.5. Illustration : un dossier concret</w:t>
-      </w:r>
-    </w:p>
-    <w:p>
-      <w:pPr>
-        <w:spacing w:after="140"/>
-        <w:jc w:val="both"/>
-      </w:pPr>
-      <w:r>
-        <w:t xml:space="preserve">Pour rendre ce fonctionnement tangible, voici un exemple de dossier tel qu'il serait traité par l'application (chiffres calculés avec la formule de scorecard et la table de perte en cas de défaut réellement utilisées par le moteur IA, pas des valeurs de façade) :</w:t>
+        <w:t xml:space="preserve">2.5. Décision à trois niveaux et explicabilité</w:t>
+      </w:r>
+    </w:p>
+    <w:p>
+      <w:pPr>
+        <w:spacing w:after="140"/>
+        <w:jc w:val="both"/>
+      </w:pPr>
+      <w:r>
+        <w:t xml:space="preserve">Plutôt qu'une réponse binaire accordé/refusé, l'outil restitue une probabilité de défaut et la classe dans l'une de trois zones : verte (dossier plutôt sûr), orange (à examiner en comité de crédit) et rouge (risque élevé). Les seuils de ces zones sont calculés automatiquement autour du seuil de décision optimal du modèle retenu, et non fixés arbitrairement à 50%. L'agent garde la main sur la décision finale, en particulier sur les dossiers orange.</w:t>
+      </w:r>
+    </w:p>
+    <w:p>
+      <w:pPr>
+        <w:spacing w:after="140"/>
+        <w:jc w:val="both"/>
+      </w:pPr>
+      <w:r>
+        <w:t xml:space="preserve">Pour chaque dossier évalué, l'application affiche également les facteurs qui ont le plus pesé sur le score, calculés avec SHAP et présentés en français plutôt que sous forme de coefficients bruts. L'objectif est qu'un agent puisse dire à un client "votre dossier est jugé plus risqué parce que X et Y", et pas seulement lui communiquer un chiffre.</w:t>
+      </w:r>
+    </w:p>
+    <w:p>
+      <w:pPr>
+        <w:pStyle w:val="Heading2"/>
+        <w:spacing w:after="90" w:before="180"/>
+      </w:pPr>
+      <w:r>
+        <w:t xml:space="preserve">2.6. Illustration : un dossier concret</w:t>
+      </w:r>
+    </w:p>
+    <w:p>
+      <w:pPr>
+        <w:spacing w:after="140"/>
+        <w:jc w:val="both"/>
+      </w:pPr>
+      <w:r>
+        <w:t xml:space="preserve">Pour rendre ce fonctionnement tangible, voici un exemple de dossier tel qu'il serait traité par l'application (chiffres calculés en faisant réellement passer ce profil dans le pipeline entraîné - préprocesseur, régression logistique retenue et explainer SHAP - pas des valeurs de façade) :</w:t>
       </w:r>
     </w:p>
     <w:tbl>
@@ -684,7 +1334,7 @@
                 <w:sz w:val="20"/>
                 <w:szCs w:val="20"/>
               </w:rPr>
-              <w:t xml:space="preserve">Commerçante, secteur informel, zone urbaine, membre de la coopérative depuis 18 mois, épargne régulière, Mobile Money actif, aucun historique de crédit interne (nouvelle emprunteuse)</w:t>
+              <w:t xml:space="preserve">Commerçante, secteur informel, zone urbaine, membre de la coopérative depuis 6 mois, épargne irrégulière, Mobile Money actif, aucun historique de crédit interne (nouvelle emprunteuse), un prêt actif ailleurs (50 000 FCFA d'encours)</w:t>
             </w:r>
           </w:p>
         </w:tc>
@@ -716,7 +1366,7 @@
                 <w:sz w:val="20"/>
                 <w:szCs w:val="20"/>
               </w:rPr>
-              <w:t xml:space="preserve">500 000 FCFA sur 12 mois, objet "Fonds de commerce", garantie proposée : caution solidaire</w:t>
+              <w:t xml:space="preserve">600 000 FCFA sur 12 mois, objet "Fonds de commerce", garantie proposée : caution solidaire</w:t>
             </w:r>
           </w:p>
         </w:tc>
@@ -748,7 +1398,7 @@
                 <w:sz w:val="20"/>
                 <w:szCs w:val="20"/>
               </w:rPr>
-              <w:t xml:space="preserve">47 % - au-dessus du seuil vert (39%) mais en-dessous du seuil rouge (64%)</w:t>
+              <w:t xml:space="preserve">71,5 % - au-dessus du seuil vert (59%) mais en-dessous du seuil rouge (84%)</w:t>
             </w:r>
           </w:p>
         </w:tc>
@@ -780,7 +1430,7 @@
                 <w:sz w:val="20"/>
                 <w:szCs w:val="20"/>
               </w:rPr>
-              <w:t xml:space="preserve">603 / 900</w:t>
+              <w:t xml:space="preserve">573 / 900</w:t>
             </w:r>
           </w:p>
         </w:tc>
@@ -812,7 +1462,7 @@
                 <w:sz w:val="20"/>
                 <w:szCs w:val="20"/>
               </w:rPr>
-              <w:t xml:space="preserve">94 000 FCFA (= probabilité de défaut x 40% de perte en cas de défaut pour une caution solidaire x montant demandé)</w:t>
+              <w:t xml:space="preserve">171 600 FCFA (= probabilité de défaut x 40% de perte en cas de défaut pour une caution solidaire x montant demandé)</w:t>
             </w:r>
           </w:p>
         </w:tc>
@@ -844,7 +1494,7 @@
                 <w:sz w:val="20"/>
                 <w:szCs w:val="20"/>
               </w:rPr>
-              <w:t xml:space="preserve">Absence d'historique de crédit interne, ratio d'endettement relativement élevé compte tenu du revenu déclaré</w:t>
+              <w:t xml:space="preserve">Absence d'historique de crédit interne (nouvelle emprunteuse), montant demandé élevé compte tenu du profil, prêt actif dans une autre institution, secteur d'activité informel</w:t>
             </w:r>
           </w:p>
         </w:tc>
@@ -876,7 +1526,7 @@
                 <w:sz w:val="20"/>
                 <w:szCs w:val="20"/>
               </w:rPr>
-              <w:t xml:space="preserve">Épargne régulière suivie par la coopérative, ancienneté de la relation, garantie par caution solidaire, usage actif du Mobile Money</w:t>
+              <w:t xml:space="preserve">Appartenance à un groupe solidaire, garantie par caution solidaire</w:t>
             </w:r>
           </w:p>
         </w:tc>
@@ -925,7 +1575,7 @@
         <w:jc w:val="both"/>
       </w:pPr>
       <w:r>
-        <w:t xml:space="preserve">Ce cas illustre l'apport concret de l'outil pour l'agent : au lieu d'un simple "oui/non", il dispose en quelques secondes d'une probabilité de défaut, d'un chiffrage du risque financier (perte attendue en FCFA) et d'une explication en langage clair des éléments qui ont pesé dans un sens ou dans l'autre - de quoi nourrir une discussion argumentée en comité de crédit plutôt qu'une décision opaque.</w:t>
+        <w:t xml:space="preserve">Ce cas illustre l'apport concret de l'outil pour l'agent : au lieu d'un simple "oui/non", il dispose en quelques secondes d'une probabilité de défaut, d'un chiffrage du risque financier (perte attendue en FCFA) et d'une explication en langage clair des éléments qui ont pesé dans un sens ou dans l'autre - de quoi nourrir une discussion argumentée en comité de crédit plutôt qu'une décision opaque. Avec une régression logistique, cette explication SHAP (LinearExplainer) reste directement lisible comme un poids stable par variable, cohérent d'un dossier à l'autre - un atout pour la formation des agents, à la différence d'un modèle à base d'arbres où l'importance d'une même variable peut varier selon ses interactions avec le reste du profil.</w:t>
       </w:r>
     </w:p>
     <w:p>
@@ -934,7 +1584,7 @@
         <w:spacing w:after="90" w:before="180"/>
       </w:pPr>
       <w:r>
-        <w:t xml:space="preserve">2.6. Application de démonstration</w:t>
+        <w:t xml:space="preserve">2.7. Application de démonstration</w:t>
       </w:r>
     </w:p>
     <w:p>
@@ -1050,6 +1700,24 @@
       </w:pPr>
       <w:r>
         <w:t xml:space="preserve">Un point mérite d'être clarifié dès maintenant plutôt que découvert au moment du déploiement : l'intégration réelle du BIC n'est pas un simple appel API gratuit et instantané. La consultation est facturée à la coopérative selon un barème fixé par la BCEAO, et les données remontées par les banques et les autres SFD ne sont mises à jour qu'une fois par mois (transmission le 10 de chaque mois). Cela veut dire que le statut BIC affiché pour un client peut avoir jusqu'à quatre semaines de décalage, et que la coopérative doit signer un accord d'accès avec le BIC régional avant de pouvoir l'interroger en production. Notre prototype simule ce signal pour démontrer sa valeur pour le score, mais son branchement réel demande une démarche administrative et un budget de consultation, pas seulement du développement logiciel - un point que nous proposons d'inscrire explicitement dans le plan de déploiement pilote.</w:t>
+      </w:r>
+    </w:p>
+    <w:p>
+      <w:pPr>
+        <w:spacing w:after="140"/>
+        <w:jc w:val="both"/>
+      </w:pPr>
+      <w:r>
+        <w:t xml:space="preserve">Une piste d'amélioration distincte, à explorer une fois des données réelles disponibles, est l'ajout de variables dites "non structurelles" ou alternatives - c'est-à-dire des signaux qui ne viennent pas d'un formulaire structuré classique. Dans le contexte des coopératives ouest-africaines, les plus pertinentes seraient : (i) des features comportementales dérivées de l'historique Mobile Money (régularité et volatilité des transactions dans le temps, pas seulement leur fréquence moyenne comme actuellement), que la coopérative détient déjà en partie via l'opérateur Mobile Money et qui ne posent pas de difficulté de collecte nouvelle ; (ii) les notes de terrain de l'agent de crédit (texte libre), qui demanderaient un traitement NLP dédié ; (iii) des données de géolocalisation de l'activité économique ; (iv) un questionnaire psychométrique, utilisé par certains acteurs de la microfinance (ex. Entrepreneurial Finance Lab) pour scorer des emprunteurs sans historique. Nous n'avons pas ajouté ces variables au générateur synthétique actuel : les fabriquer artificiellement dans un dataset déjà simulé aurait ajouté une deuxième couche de données inventées sans valeur démonstrative réelle, et (ii) à (iv) soulèvent des questions de consentement et de conformité à la loi burkinabè sur la protection des données à caractère personnel qui dépassent le cadre de ce prototype. La priorité que nous recommandons, dans l'ordre, est donc : d'abord recalibrer le générateur et le modèle sur des données réelles de coopérative (étape déjà planifiée ci-dessus), puis enrichir les features Mobile Money existantes (faisabilité immédiate, pas de nouvelle collecte), et seulement ensuite étudier les données de terrain plus lourdes à mettre en place (iii et iv), en associant dès cette étape le référent protection des données de la coopérative partenaire.</w:t>
+      </w:r>
+    </w:p>
+    <w:p>
+      <w:pPr>
+        <w:spacing w:after="140"/>
+        <w:jc w:val="both"/>
+      </w:pPr>
+      <w:r>
+        <w:t xml:space="preserve">Enfin, comme signalé en 2.4, le seuil de décision déployé (0,74) est actuellement choisi à partir d'un unique jeu de validation de 600 dossiers, ce qui laisse une marge d'incertitude visible sur le jeu de test (le seuil optimisé y fait légèrement moins bien qu'un seuil naïf de 0,5). Une fois un volume de données réelles suffisant disponible, nous recommandons de stabiliser ce choix par validation croisée répétée ou bootstrap (estimer le seuil optimal sur plusieurs ré-échantillonnages plutôt que sur un seul jeu de validation, puis retenir la médiane ou la moyenne), une pratique standard pour réduire la variance d'un seuil de décision estimé sur un échantillon de taille modeste.</w:t>
       </w:r>
     </w:p>
     <w:p>

</xml_diff>